<commit_message>
update report and presentation
</commit_message>
<xml_diff>
--- a/ensemble_learning_report.docx
+++ b/ensemble_learning_report.docx
@@ -3419,13 +3419,25 @@
       <w:pPr>
         <w:spacing w:after="120"/>
         <w:jc w:val="both"/>
-      </w:pPr>
-      <w:r>
-        <w:rPr>
-          <w:color w:val="000000"/>
-        </w:rPr>
-        <w:t>Barata, C. (2021). Clinical decision support systems in cardiology. Journal of Medical Systems, 45(3), 1-12. https://doi.org/10.1007/s10916-021-01700-x</w:t>
-      </w:r>
+        <w:rPr>
+          <w:color w:val="000000"/>
+        </w:rPr>
+      </w:pPr>
+      <w:r>
+        <w:rPr>
+          <w:color w:val="000000"/>
+        </w:rPr>
+        <w:t xml:space="preserve">Barata, C. (2021). Clinical decision support systems in cardiology. Journal of Medical Systems, 45(3), 1-12. </w:t>
+      </w:r>
+      <w:hyperlink r:id="rId19" w:history="1">
+        <w:r>
+          <w:rPr>
+            <w:rStyle w:val="Kpr"/>
+            <w:u w:val="none"/>
+          </w:rPr>
+          <w:t>https://doi.org/10.1007/s10916-021-01700-x</w:t>
+        </w:r>
+      </w:hyperlink>
     </w:p>
     <w:p>
       <w:pPr>
@@ -3436,8 +3448,23 @@
         <w:rPr>
           <w:color w:val="000000"/>
         </w:rPr>
-        <w:t>Davarcı, F., Turan, D., Ozcelik, B., &amp; Poncelet, D. (2017). The influence of solution viscosities and surface tension on calcium-alginate microbead formation using dripping technique. Food Hydrocolloids, 62, 119-127. https://doi.org/10.1016/j.foodhyd.2016.06.029</w:t>
-      </w:r>
+        <w:t>Damarla, R.</w:t>
+      </w:r>
+      <w:r>
+        <w:rPr>
+          <w:color w:val="000000"/>
+        </w:rPr>
+        <w:t xml:space="preserve"> Kaggle. (2024). Heart Disease Prediction Dataset. </w:t>
+      </w:r>
+      <w:hyperlink r:id="rId20" w:history="1">
+        <w:r>
+          <w:rPr>
+            <w:rStyle w:val="Kpr"/>
+            <w:u w:val="none"/>
+          </w:rPr>
+          <w:t>https://www.kaggle.com/datasets/rishidamarla/heart-disease-prediction</w:t>
+        </w:r>
+      </w:hyperlink>
     </w:p>
     <w:p>
       <w:pPr>
@@ -3448,7 +3475,7 @@
         <w:rPr>
           <w:color w:val="000000"/>
         </w:rPr>
-        <w:t>Kaggle. (2024). Heart Disease Prediction Dataset. https://www.kaggle.com/datasets/ineubauer/heart-disease-prediction Accessed: 2025.</w:t>
+        <w:t>Davarcı, F., Turan, D., Ozcelik, B., &amp; Poncelet, D. (2017). The influence of solution viscosities and surface tension on calcium-alginate microbead formation using dripping technique. Food Hydrocolloids, 62, 119-127. https://doi.org/10.1016/j.foodhyd.2016.06.029</w:t>
       </w:r>
     </w:p>
     <w:p>
@@ -3514,8 +3541,8 @@
       </w:r>
     </w:p>
     <w:sectPr>
-      <w:headerReference w:type="default" r:id="rId19"/>
-      <w:footerReference w:type="default" r:id="rId20"/>
+      <w:headerReference w:type="default" r:id="rId21"/>
+      <w:footerReference w:type="default" r:id="rId22"/>
       <w:pgSz w:w="11906" w:h="16838"/>
       <w:pgMar w:top="1418" w:right="851" w:bottom="1134" w:left="851" w:header="708" w:footer="708" w:gutter="0"/>
       <w:cols w:space="708"/>
@@ -4213,7 +4240,6 @@
   <w:style w:type="character" w:default="1" w:styleId="VarsaylanParagrafYazTipi">
     <w:name w:val="Default Paragraph Font"/>
     <w:uiPriority w:val="1"/>
-    <w:semiHidden/>
     <w:unhideWhenUsed/>
   </w:style>
   <w:style w:type="table" w:default="1" w:styleId="NormalTablo">
@@ -4327,6 +4353,18 @@
     <w:rPr>
       <w:sz w:val="20"/>
       <w:szCs w:val="20"/>
+    </w:rPr>
+  </w:style>
+  <w:style w:type="character" w:styleId="zmlenmeyenBahsetme">
+    <w:name w:val="Unresolved Mention"/>
+    <w:basedOn w:val="VarsaylanParagrafYazTipi"/>
+    <w:uiPriority w:val="99"/>
+    <w:semiHidden/>
+    <w:unhideWhenUsed/>
+    <w:rsid w:val="0012471B"/>
+    <w:rPr>
+      <w:color w:val="605E5C"/>
+      <w:shd w:val="clear" w:color="auto" w:fill="E1DFDD"/>
     </w:rPr>
   </w:style>
 </w:styles>

</xml_diff>